<commit_message>
Switch from "initialize" to "insert key" for race car game
</commit_message>
<xml_diff>
--- a/CourseMaterials/03_abstraction/00_race_car/race_car.docx
+++ b/CourseMaterials/03_abstraction/00_race_car/race_car.docx
@@ -57,7 +57,19 @@
         <w:rPr>
           <w:rFonts w:ascii="Garamond" w:hAnsi="Garamond"/>
         </w:rPr>
-        <w:t>a racing game using</w:t>
+        <w:t>a rac</w:t>
+      </w:r>
+      <w:r>
+        <w:rPr>
+          <w:rFonts w:ascii="Garamond" w:hAnsi="Garamond"/>
+        </w:rPr>
+        <w:t>e car</w:t>
+      </w:r>
+      <w:r>
+        <w:rPr>
+          <w:rFonts w:ascii="Garamond" w:hAnsi="Garamond"/>
+        </w:rPr>
+        <w:t xml:space="preserve"> game using</w:t>
       </w:r>
       <w:r>
         <w:rPr>
@@ -99,7 +111,7 @@
         <w:rPr>
           <w:rFonts w:ascii="Garamond" w:hAnsi="Garamond"/>
         </w:rPr>
-        <w:t xml:space="preserve">The reason that these functions are required is that the game requires realistic physics that is a bit too advanced for middle school. </w:t>
+        <w:t xml:space="preserve">The reason that these functions are required is that the game requires realistic physics that is too advanced for middle school. </w:t>
       </w:r>
       <w:r>
         <w:rPr>
@@ -418,21 +430,43 @@
         <w:rPr>
           <w:rFonts w:ascii="Garamond" w:hAnsi="Garamond"/>
         </w:rPr>
-        <w:t>program utilize the five functions (</w:t>
-      </w:r>
-      <w:proofErr w:type="spellStart"/>
-      <w:r>
-        <w:rPr>
-          <w:rFonts w:ascii="Garamond" w:hAnsi="Garamond"/>
-        </w:rPr>
-        <w:t>init</w:t>
-      </w:r>
-      <w:proofErr w:type="spellEnd"/>
-      <w:r>
-        <w:rPr>
-          <w:rFonts w:ascii="Garamond" w:hAnsi="Garamond"/>
-        </w:rPr>
-        <w:t>, turn left/right, speed up, and slow down)</w:t>
+        <w:t xml:space="preserve">program </w:t>
+      </w:r>
+      <w:r>
+        <w:rPr>
+          <w:rFonts w:ascii="Garamond" w:hAnsi="Garamond"/>
+        </w:rPr>
+        <w:t>use</w:t>
+      </w:r>
+      <w:r>
+        <w:rPr>
+          <w:rFonts w:ascii="Garamond" w:hAnsi="Garamond"/>
+        </w:rPr>
+        <w:t xml:space="preserve"> </w:t>
+      </w:r>
+      <w:r>
+        <w:rPr>
+          <w:rFonts w:ascii="Garamond" w:hAnsi="Garamond"/>
+        </w:rPr>
+        <w:t>the given</w:t>
+      </w:r>
+      <w:r>
+        <w:rPr>
+          <w:rFonts w:ascii="Garamond" w:hAnsi="Garamond"/>
+        </w:rPr>
+        <w:t xml:space="preserve"> functions (</w:t>
+      </w:r>
+      <w:r>
+        <w:rPr>
+          <w:rFonts w:ascii="Garamond" w:hAnsi="Garamond"/>
+        </w:rPr>
+        <w:t>insert key</w:t>
+      </w:r>
+      <w:r>
+        <w:rPr>
+          <w:rFonts w:ascii="Garamond" w:hAnsi="Garamond"/>
+        </w:rPr>
+        <w:t>, turn left/right, speed up, slow down)</w:t>
       </w:r>
     </w:p>
     <w:p>
@@ -449,6 +483,129 @@
         <w:rPr>
           <w:rFonts w:ascii="Garamond" w:hAnsi="Garamond"/>
         </w:rPr>
+        <w:t xml:space="preserve">Make the </w:t>
+      </w:r>
+      <w:r>
+        <w:rPr>
+          <w:rFonts w:ascii="Garamond" w:hAnsi="Garamond"/>
+        </w:rPr>
+        <w:t>race car</w:t>
+      </w:r>
+      <w:r>
+        <w:rPr>
+          <w:rFonts w:ascii="Garamond" w:hAnsi="Garamond"/>
+        </w:rPr>
+        <w:t xml:space="preserve"> </w:t>
+      </w:r>
+      <w:r>
+        <w:rPr>
+          <w:rFonts w:ascii="Garamond" w:hAnsi="Garamond"/>
+        </w:rPr>
+        <w:t xml:space="preserve">speed up when the </w:t>
+      </w:r>
+      <w:r>
+        <w:rPr>
+          <w:rFonts w:ascii="Garamond" w:hAnsi="Garamond"/>
+        </w:rPr>
+        <w:t>space bar is pressed</w:t>
+      </w:r>
+    </w:p>
+    <w:p>
+      <w:pPr>
+        <w:ind w:firstLine="540"/>
+        <w:rPr>
+          <w:rFonts w:ascii="Garamond" w:hAnsi="Garamond"/>
+        </w:rPr>
+      </w:pPr>
+      <w:r>
+        <w:t xml:space="preserve">□ </w:t>
+      </w:r>
+      <w:r>
+        <w:rPr>
+          <w:rFonts w:ascii="Garamond" w:hAnsi="Garamond"/>
+        </w:rPr>
+        <w:t xml:space="preserve">Make the </w:t>
+      </w:r>
+      <w:r>
+        <w:rPr>
+          <w:rFonts w:ascii="Garamond" w:hAnsi="Garamond"/>
+        </w:rPr>
+        <w:t>race car</w:t>
+      </w:r>
+      <w:r>
+        <w:rPr>
+          <w:rFonts w:ascii="Garamond" w:hAnsi="Garamond"/>
+        </w:rPr>
+        <w:t xml:space="preserve"> </w:t>
+      </w:r>
+      <w:r>
+        <w:rPr>
+          <w:rFonts w:ascii="Garamond" w:hAnsi="Garamond"/>
+        </w:rPr>
+        <w:t xml:space="preserve">slow down when the </w:t>
+      </w:r>
+      <w:r>
+        <w:rPr>
+          <w:rFonts w:ascii="Garamond" w:hAnsi="Garamond"/>
+        </w:rPr>
+        <w:t xml:space="preserve">space bar is </w:t>
+      </w:r>
+      <w:r>
+        <w:rPr>
+          <w:rFonts w:ascii="Garamond" w:hAnsi="Garamond"/>
+        </w:rPr>
+        <w:t>released</w:t>
+      </w:r>
+    </w:p>
+    <w:p>
+      <w:pPr>
+        <w:ind w:firstLine="540"/>
+        <w:rPr>
+          <w:rFonts w:ascii="Garamond" w:hAnsi="Garamond"/>
+        </w:rPr>
+      </w:pPr>
+      <w:r>
+        <w:t xml:space="preserve">□ </w:t>
+      </w:r>
+      <w:r>
+        <w:rPr>
+          <w:rFonts w:ascii="Garamond" w:hAnsi="Garamond"/>
+        </w:rPr>
+        <w:t xml:space="preserve">Make the </w:t>
+      </w:r>
+      <w:r>
+        <w:rPr>
+          <w:rFonts w:ascii="Garamond" w:hAnsi="Garamond"/>
+        </w:rPr>
+        <w:t>race car</w:t>
+      </w:r>
+      <w:r>
+        <w:rPr>
+          <w:rFonts w:ascii="Garamond" w:hAnsi="Garamond"/>
+        </w:rPr>
+        <w:t xml:space="preserve"> </w:t>
+      </w:r>
+      <w:r>
+        <w:rPr>
+          <w:rFonts w:ascii="Garamond" w:hAnsi="Garamond"/>
+        </w:rPr>
+        <w:t>turn in the proper direction when the arrow keys are pressed</w:t>
+      </w:r>
+    </w:p>
+    <w:p>
+      <w:pPr>
+        <w:ind w:firstLine="540"/>
+        <w:rPr>
+          <w:rFonts w:ascii="Garamond" w:hAnsi="Garamond"/>
+        </w:rPr>
+      </w:pPr>
+      <w:r>
+        <w:t xml:space="preserve">□ </w:t>
+      </w:r>
+      <w:r>
+        <w:rPr>
+          <w:rFonts w:ascii="Garamond" w:hAnsi="Garamond"/>
+        </w:rPr>
         <w:t xml:space="preserve">Make </w:t>
       </w:r>
       <w:r>
@@ -486,70 +643,6 @@
           <w:rFonts w:ascii="Garamond" w:hAnsi="Garamond"/>
         </w:rPr>
         <w:t>ite down whenever it’s touching green</w:t>
-      </w:r>
-    </w:p>
-    <w:p>
-      <w:pPr>
-        <w:ind w:firstLine="540"/>
-        <w:rPr>
-          <w:rFonts w:ascii="Garamond" w:hAnsi="Garamond"/>
-        </w:rPr>
-      </w:pPr>
-      <w:r>
-        <w:t xml:space="preserve">□ </w:t>
-      </w:r>
-      <w:r>
-        <w:rPr>
-          <w:rFonts w:ascii="Garamond" w:hAnsi="Garamond"/>
-        </w:rPr>
-        <w:t xml:space="preserve">Make the program </w:t>
-      </w:r>
-      <w:r>
-        <w:rPr>
-          <w:rFonts w:ascii="Garamond" w:hAnsi="Garamond"/>
-        </w:rPr>
-        <w:t xml:space="preserve">speed up the sprite when the </w:t>
-      </w:r>
-      <w:r>
-        <w:rPr>
-          <w:rFonts w:ascii="Garamond" w:hAnsi="Garamond"/>
-        </w:rPr>
-        <w:t>space bar is pressed</w:t>
-      </w:r>
-    </w:p>
-    <w:p>
-      <w:pPr>
-        <w:ind w:firstLine="540"/>
-        <w:rPr>
-          <w:rFonts w:ascii="Garamond" w:hAnsi="Garamond"/>
-        </w:rPr>
-      </w:pPr>
-      <w:r>
-        <w:t xml:space="preserve">□ </w:t>
-      </w:r>
-      <w:r>
-        <w:rPr>
-          <w:rFonts w:ascii="Garamond" w:hAnsi="Garamond"/>
-        </w:rPr>
-        <w:t xml:space="preserve">Make the program </w:t>
-      </w:r>
-      <w:r>
-        <w:rPr>
-          <w:rFonts w:ascii="Garamond" w:hAnsi="Garamond"/>
-        </w:rPr>
-        <w:t xml:space="preserve">slow down the sprite when the </w:t>
-      </w:r>
-      <w:r>
-        <w:rPr>
-          <w:rFonts w:ascii="Garamond" w:hAnsi="Garamond"/>
-        </w:rPr>
-        <w:t xml:space="preserve">space bar is </w:t>
-      </w:r>
-      <w:r>
-        <w:rPr>
-          <w:rFonts w:ascii="Garamond" w:hAnsi="Garamond"/>
-        </w:rPr>
-        <w:t>released</w:t>
       </w:r>
     </w:p>
     <w:p/>
@@ -714,7 +807,19 @@
         <w:rPr>
           <w:rFonts w:ascii="Garamond" w:hAnsi="Garamond"/>
         </w:rPr>
-        <w:t>a finish line, a “halfway line”, AND a variable to track the last one you hit</w:t>
+        <w:t xml:space="preserve">a variable to track </w:t>
+      </w:r>
+      <w:r>
+        <w:rPr>
+          <w:rFonts w:ascii="Garamond" w:hAnsi="Garamond"/>
+        </w:rPr>
+        <w:t xml:space="preserve">whether you hit the finish line OR the halfway line </w:t>
+      </w:r>
+      <w:r>
+        <w:rPr>
+          <w:rFonts w:ascii="Garamond" w:hAnsi="Garamond"/>
+        </w:rPr>
+        <w:t>last</w:t>
       </w:r>
     </w:p>
     <w:p>
@@ -754,7 +859,7 @@
         <w:rPr>
           <w:rFonts w:ascii="Garamond" w:hAnsi="Garamond"/>
         </w:rPr>
-        <w:t xml:space="preserve">        Hint: You likely need to have a lap counter to make this work</w:t>
+        <w:t xml:space="preserve">        Hint: You need to have a lap counter to make this work</w:t>
       </w:r>
     </w:p>
     <w:p>

</xml_diff>